<commit_message>
chore: update portfolio title and resume framework document
</commit_message>
<xml_diff>
--- a/General Resume Framework.docx
+++ b/General Resume Framework.docx
@@ -7,13 +7,13 @@
         <w:pStyle w:val="Heading1"/>
         <w:spacing w:before="0" w:after="120" w:line="275" w:lineRule="auto"/>
         <w:rPr>
-          <w:rFonts w:ascii="Times New Roman" w:eastAsia="Google Sans" w:hAnsi="Times New Roman" w:cs="Times New Roman"/>
-          <w:color w:val="1F1F1F"/>
-        </w:rPr>
-      </w:pPr>
-      <w:r>
-        <w:rPr>
-          <w:rFonts w:ascii="Times New Roman" w:eastAsia="Google Sans" w:hAnsi="Times New Roman" w:cs="Times New Roman"/>
+          <w:rFonts w:ascii="Google Sans" w:eastAsia="Google Sans" w:hAnsi="Google Sans" w:cs="Google Sans"/>
+          <w:color w:val="1F1F1F"/>
+        </w:rPr>
+      </w:pPr>
+      <w:r>
+        <w:rPr>
+          <w:rFonts w:ascii="Google Sans" w:eastAsia="Google Sans" w:hAnsi="Google Sans" w:cs="Google Sans"/>
           <w:color w:val="1F1F1F"/>
         </w:rPr>
         <w:t>Tony Kipchirchir</w:t>
@@ -30,18 +30,14 @@
         </w:pBdr>
         <w:spacing w:after="240" w:line="275" w:lineRule="auto"/>
         <w:rPr>
-          <w:rFonts w:ascii="Times New Roman" w:eastAsia="Google Sans" w:hAnsi="Times New Roman" w:cs="Times New Roman"/>
-          <w:color w:val="1F1F1F"/>
-          <w:sz w:val="24"/>
-          <w:szCs w:val="24"/>
-        </w:rPr>
-      </w:pPr>
-      <w:r>
-        <w:rPr>
-          <w:rFonts w:ascii="Times New Roman" w:eastAsia="Google Sans" w:hAnsi="Times New Roman" w:cs="Times New Roman"/>
-          <w:color w:val="1F1F1F"/>
-          <w:sz w:val="24"/>
-          <w:szCs w:val="24"/>
+          <w:rFonts w:ascii="Google Sans" w:eastAsia="Google Sans" w:hAnsi="Google Sans" w:cs="Google Sans"/>
+          <w:color w:val="1F1F1F"/>
+        </w:rPr>
+      </w:pPr>
+      <w:r>
+        <w:rPr>
+          <w:rFonts w:ascii="Google Sans" w:eastAsia="Google Sans" w:hAnsi="Google Sans" w:cs="Google Sans"/>
+          <w:color w:val="1F1F1F"/>
         </w:rPr>
         <w:t xml:space="preserve">+254704679909 | kipchirchir.tony@outlook.com | </w:t>
       </w:r>
@@ -49,10 +45,8 @@
         <w:r>
           <w:rPr>
             <w:rStyle w:val="Hyperlink"/>
-            <w:rFonts w:ascii="Times New Roman" w:eastAsia="Google Sans" w:hAnsi="Times New Roman" w:cs="Times New Roman"/>
+            <w:rFonts w:ascii="Google Sans" w:eastAsia="Google Sans" w:hAnsi="Google Sans" w:cs="Google Sans"/>
             <w:color w:val="auto"/>
-            <w:sz w:val="24"/>
-            <w:szCs w:val="24"/>
             <w:u w:val="none"/>
           </w:rPr>
           <w:t>LinkedIn</w:t>
@@ -64,13 +58,13 @@
         <w:pStyle w:val="Heading2"/>
         <w:spacing w:before="0" w:after="120" w:line="275" w:lineRule="auto"/>
         <w:rPr>
-          <w:rFonts w:ascii="Times New Roman" w:eastAsia="Google Sans" w:hAnsi="Times New Roman" w:cs="Times New Roman"/>
-          <w:color w:val="1F1F1F"/>
-        </w:rPr>
-      </w:pPr>
-      <w:r>
-        <w:rPr>
-          <w:rFonts w:ascii="Times New Roman" w:eastAsia="Google Sans" w:hAnsi="Times New Roman" w:cs="Times New Roman"/>
+          <w:rFonts w:ascii="Google Sans" w:eastAsia="Google Sans" w:hAnsi="Google Sans" w:cs="Google Sans"/>
+          <w:color w:val="1F1F1F"/>
+        </w:rPr>
+      </w:pPr>
+      <w:r>
+        <w:rPr>
+          <w:rFonts w:ascii="Google Sans" w:eastAsia="Google Sans" w:hAnsi="Google Sans" w:cs="Google Sans"/>
           <w:color w:val="1F1F1F"/>
         </w:rPr>
         <w:t>Professional Summary</w:t>
@@ -87,20 +81,30 @@
         </w:pBdr>
         <w:spacing w:after="240" w:line="275" w:lineRule="auto"/>
         <w:rPr>
-          <w:rFonts w:ascii="Times New Roman" w:eastAsia="Google Sans" w:hAnsi="Times New Roman" w:cs="Times New Roman"/>
-          <w:color w:val="1F1F1F"/>
-          <w:sz w:val="24"/>
-          <w:szCs w:val="24"/>
-        </w:rPr>
-      </w:pPr>
-      <w:r>
-        <w:rPr>
-          <w:rFonts w:ascii="Times New Roman" w:eastAsia="Google Sans" w:hAnsi="Times New Roman" w:cs="Times New Roman"/>
-          <w:color w:val="1F1F1F"/>
-          <w:sz w:val="24"/>
-          <w:szCs w:val="24"/>
-        </w:rPr>
-        <w:t>Electrical and Electronics Engineering graduate combining formal academic training with over four years of hands-on PCB repair and hardware troubleshooting experience. Capable of diagnosing complex multi-layer boards down to the component level, alongside designing custom embedded prototypes like a real-time Visible Light Communication (VLC) transceiver. Seeking to apply practical circuit debugging, RF signal testing, and embedded programming skills to an entry-level engineering role in hardware development, telecommunications, or signal processing.</w:t>
+          <w:rFonts w:ascii="Google Sans" w:eastAsia="Google Sans" w:hAnsi="Google Sans" w:cs="Google Sans"/>
+          <w:color w:val="1F1F1F"/>
+        </w:rPr>
+      </w:pPr>
+      <w:r>
+        <w:rPr>
+          <w:rFonts w:ascii="Google Sans" w:eastAsia="Google Sans" w:hAnsi="Google Sans" w:cs="Google Sans"/>
+          <w:color w:val="1F1F1F"/>
+        </w:rPr>
+        <w:t xml:space="preserve">Electrical and Electronics Engineering graduate combining formal academic training with over four years of hands-on PCB repair and hardware troubleshooting experience. Capable of diagnosing complex multi-layer boards down to the component level, alongside </w:t>
+      </w:r>
+      <w:r>
+        <w:rPr>
+          <w:rFonts w:ascii="Google Sans" w:eastAsia="Google Sans" w:hAnsi="Google Sans" w:cs="Google Sans"/>
+          <w:color w:val="1F1F1F"/>
+        </w:rPr>
+        <w:t>designing custom embedded prototypes like a real-time Visible Light Communication (VLC) transceiver. Seeking to apply practical circuit debugging, RF signal testing, and embedded programming skills to an entry-level engineering role in hardware development</w:t>
+      </w:r>
+      <w:r>
+        <w:rPr>
+          <w:rFonts w:ascii="Google Sans" w:eastAsia="Google Sans" w:hAnsi="Google Sans" w:cs="Google Sans"/>
+          <w:color w:val="1F1F1F"/>
+        </w:rPr>
+        <w:t>, telecommunications, or signal processing.</w:t>
       </w:r>
     </w:p>
     <w:p>
@@ -108,13 +112,13 @@
         <w:pStyle w:val="Heading2"/>
         <w:spacing w:before="0" w:after="120" w:line="275" w:lineRule="auto"/>
         <w:rPr>
-          <w:rFonts w:ascii="Times New Roman" w:eastAsia="Google Sans" w:hAnsi="Times New Roman" w:cs="Times New Roman"/>
-          <w:color w:val="1F1F1F"/>
-        </w:rPr>
-      </w:pPr>
-      <w:r>
-        <w:rPr>
-          <w:rFonts w:ascii="Times New Roman" w:eastAsia="Google Sans" w:hAnsi="Times New Roman" w:cs="Times New Roman"/>
+          <w:rFonts w:ascii="Google Sans" w:eastAsia="Google Sans" w:hAnsi="Google Sans" w:cs="Google Sans"/>
+          <w:color w:val="1F1F1F"/>
+        </w:rPr>
+      </w:pPr>
+      <w:r>
+        <w:rPr>
+          <w:rFonts w:ascii="Google Sans" w:eastAsia="Google Sans" w:hAnsi="Google Sans" w:cs="Google Sans"/>
           <w:color w:val="1F1F1F"/>
         </w:rPr>
         <w:t>Skills</w:t>
@@ -131,22 +135,18 @@
         </w:pBdr>
         <w:spacing w:after="120" w:line="275" w:lineRule="auto"/>
         <w:rPr>
-          <w:rFonts w:ascii="Times New Roman" w:eastAsia="Google Sans" w:hAnsi="Times New Roman" w:cs="Times New Roman"/>
+          <w:rFonts w:ascii="Google Sans" w:eastAsia="Google Sans" w:hAnsi="Google Sans" w:cs="Google Sans"/>
           <w:b/>
           <w:bCs/>
           <w:color w:val="1F1F1F"/>
-          <w:sz w:val="24"/>
-          <w:szCs w:val="24"/>
-        </w:rPr>
-      </w:pPr>
-      <w:r>
-        <w:rPr>
-          <w:rFonts w:ascii="Times New Roman" w:eastAsia="Google Sans" w:hAnsi="Times New Roman" w:cs="Times New Roman"/>
+        </w:rPr>
+      </w:pPr>
+      <w:r>
+        <w:rPr>
+          <w:rFonts w:ascii="Google Sans" w:eastAsia="Google Sans" w:hAnsi="Google Sans" w:cs="Google Sans"/>
           <w:b/>
           <w:bCs/>
           <w:color w:val="1F1F1F"/>
-          <w:sz w:val="24"/>
-          <w:szCs w:val="24"/>
         </w:rPr>
         <w:t>Technical Skills:</w:t>
       </w:r>
@@ -165,29 +165,20 @@
           <w:between w:val="nil"/>
         </w:pBdr>
         <w:spacing w:line="275" w:lineRule="auto"/>
-        <w:rPr>
-          <w:rFonts w:ascii="Times New Roman" w:hAnsi="Times New Roman" w:cs="Times New Roman"/>
-          <w:sz w:val="24"/>
-          <w:szCs w:val="24"/>
-        </w:rPr>
-      </w:pPr>
-      <w:r>
-        <w:rPr>
-          <w:rFonts w:ascii="Times New Roman" w:eastAsia="Google Sans" w:hAnsi="Times New Roman" w:cs="Times New Roman"/>
+      </w:pPr>
+      <w:r>
+        <w:rPr>
+          <w:rFonts w:ascii="Google Sans" w:eastAsia="Google Sans" w:hAnsi="Google Sans" w:cs="Google Sans"/>
           <w:b/>
           <w:bCs/>
           <w:color w:val="1F1F1F"/>
-          <w:sz w:val="24"/>
-          <w:szCs w:val="24"/>
         </w:rPr>
         <w:t>Hardware &amp; Diagnostics:</w:t>
       </w:r>
       <w:r>
         <w:rPr>
-          <w:rFonts w:ascii="Times New Roman" w:eastAsia="Google Sans" w:hAnsi="Times New Roman" w:cs="Times New Roman"/>
-          <w:color w:val="1F1F1F"/>
-          <w:sz w:val="24"/>
-          <w:szCs w:val="24"/>
+          <w:rFonts w:ascii="Google Sans" w:eastAsia="Google Sans" w:hAnsi="Google Sans" w:cs="Google Sans"/>
+          <w:color w:val="1F1F1F"/>
         </w:rPr>
         <w:t xml:space="preserve"> Component-Level Troubleshooting, SMD Micro-soldering, Schematic Tracing, PCB Rework, Multimeters, Oscilloscopes, Spectrum Analyzers</w:t>
       </w:r>
@@ -206,31 +197,29 @@
           <w:between w:val="nil"/>
         </w:pBdr>
         <w:spacing w:line="275" w:lineRule="auto"/>
-        <w:rPr>
-          <w:rFonts w:ascii="Times New Roman" w:hAnsi="Times New Roman" w:cs="Times New Roman"/>
-          <w:sz w:val="24"/>
-          <w:szCs w:val="24"/>
-        </w:rPr>
-      </w:pPr>
-      <w:r>
-        <w:rPr>
-          <w:rFonts w:ascii="Times New Roman" w:eastAsia="Google Sans" w:hAnsi="Times New Roman" w:cs="Times New Roman"/>
+      </w:pPr>
+      <w:r>
+        <w:rPr>
+          <w:rFonts w:ascii="Google Sans" w:eastAsia="Google Sans" w:hAnsi="Google Sans" w:cs="Google Sans"/>
           <w:b/>
           <w:bCs/>
           <w:color w:val="1F1F1F"/>
-          <w:sz w:val="24"/>
-          <w:szCs w:val="24"/>
         </w:rPr>
         <w:t>Embedded &amp; Software:</w:t>
       </w:r>
       <w:r>
         <w:rPr>
-          <w:rFonts w:ascii="Times New Roman" w:eastAsia="Google Sans" w:hAnsi="Times New Roman" w:cs="Times New Roman"/>
-          <w:color w:val="1F1F1F"/>
-          <w:sz w:val="24"/>
-          <w:szCs w:val="24"/>
-        </w:rPr>
-        <w:t xml:space="preserve"> C, C++, Python, Arduino, MATLAB, Simulink, TINA TI</w:t>
+          <w:rFonts w:ascii="Google Sans" w:eastAsia="Google Sans" w:hAnsi="Google Sans" w:cs="Google Sans"/>
+          <w:color w:val="1F1F1F"/>
+        </w:rPr>
+        <w:t xml:space="preserve"> C, C++, Py</w:t>
+      </w:r>
+      <w:r>
+        <w:rPr>
+          <w:rFonts w:ascii="Google Sans" w:eastAsia="Google Sans" w:hAnsi="Google Sans" w:cs="Google Sans"/>
+          <w:color w:val="1F1F1F"/>
+        </w:rPr>
+        <w:t>thon, Arduino, MATLAB, Simulink, TINA TI</w:t>
       </w:r>
     </w:p>
     <w:p>
@@ -247,29 +236,20 @@
           <w:between w:val="nil"/>
         </w:pBdr>
         <w:spacing w:after="120" w:line="275" w:lineRule="auto"/>
-        <w:rPr>
-          <w:rFonts w:ascii="Times New Roman" w:hAnsi="Times New Roman" w:cs="Times New Roman"/>
-          <w:sz w:val="24"/>
-          <w:szCs w:val="24"/>
-        </w:rPr>
-      </w:pPr>
-      <w:r>
-        <w:rPr>
-          <w:rFonts w:ascii="Times New Roman" w:eastAsia="Google Sans" w:hAnsi="Times New Roman" w:cs="Times New Roman"/>
+      </w:pPr>
+      <w:r>
+        <w:rPr>
+          <w:rFonts w:ascii="Google Sans" w:eastAsia="Google Sans" w:hAnsi="Google Sans" w:cs="Google Sans"/>
           <w:b/>
           <w:bCs/>
           <w:color w:val="1F1F1F"/>
-          <w:sz w:val="24"/>
-          <w:szCs w:val="24"/>
         </w:rPr>
         <w:t>Protocols &amp; Signals:</w:t>
       </w:r>
       <w:r>
         <w:rPr>
-          <w:rFonts w:ascii="Times New Roman" w:eastAsia="Google Sans" w:hAnsi="Times New Roman" w:cs="Times New Roman"/>
-          <w:color w:val="1F1F1F"/>
-          <w:sz w:val="24"/>
-          <w:szCs w:val="24"/>
+          <w:rFonts w:ascii="Google Sans" w:eastAsia="Google Sans" w:hAnsi="Google Sans" w:cs="Google Sans"/>
+          <w:color w:val="1F1F1F"/>
         </w:rPr>
         <w:t xml:space="preserve"> I2C, SPI, UART, PWM, ADC, RF Diagnostics, VSWR Testing</w:t>
       </w:r>
@@ -285,22 +265,18 @@
         </w:pBdr>
         <w:spacing w:before="120" w:after="120" w:line="275" w:lineRule="auto"/>
         <w:rPr>
-          <w:rFonts w:ascii="Times New Roman" w:eastAsia="Google Sans" w:hAnsi="Times New Roman" w:cs="Times New Roman"/>
+          <w:rFonts w:ascii="Google Sans" w:eastAsia="Google Sans" w:hAnsi="Google Sans" w:cs="Google Sans"/>
           <w:b/>
           <w:bCs/>
           <w:color w:val="1F1F1F"/>
-          <w:sz w:val="24"/>
-          <w:szCs w:val="24"/>
-        </w:rPr>
-      </w:pPr>
-      <w:r>
-        <w:rPr>
-          <w:rFonts w:ascii="Times New Roman" w:eastAsia="Google Sans" w:hAnsi="Times New Roman" w:cs="Times New Roman"/>
+        </w:rPr>
+      </w:pPr>
+      <w:r>
+        <w:rPr>
+          <w:rFonts w:ascii="Google Sans" w:eastAsia="Google Sans" w:hAnsi="Google Sans" w:cs="Google Sans"/>
           <w:b/>
           <w:bCs/>
           <w:color w:val="1F1F1F"/>
-          <w:sz w:val="24"/>
-          <w:szCs w:val="24"/>
         </w:rPr>
         <w:t>Leadership &amp; Interpersonal:</w:t>
       </w:r>
@@ -319,18 +295,11 @@
           <w:between w:val="nil"/>
         </w:pBdr>
         <w:spacing w:after="120" w:line="275" w:lineRule="auto"/>
-        <w:rPr>
-          <w:rFonts w:ascii="Times New Roman" w:hAnsi="Times New Roman" w:cs="Times New Roman"/>
-          <w:sz w:val="24"/>
-          <w:szCs w:val="24"/>
-        </w:rPr>
-      </w:pPr>
-      <w:r>
-        <w:rPr>
-          <w:rFonts w:ascii="Times New Roman" w:eastAsia="Google Sans" w:hAnsi="Times New Roman" w:cs="Times New Roman"/>
-          <w:color w:val="1F1F1F"/>
-          <w:sz w:val="24"/>
-          <w:szCs w:val="24"/>
+      </w:pPr>
+      <w:r>
+        <w:rPr>
+          <w:rFonts w:ascii="Google Sans" w:eastAsia="Google Sans" w:hAnsi="Google Sans" w:cs="Google Sans"/>
+          <w:color w:val="1F1F1F"/>
         </w:rPr>
         <w:t>Project Mentorship, Technical Instruction, Client Relations, Independent Project Management, Workflow Optimization</w:t>
       </w:r>
@@ -340,13 +309,13 @@
         <w:pStyle w:val="Heading2"/>
         <w:spacing w:before="120" w:after="120" w:line="275" w:lineRule="auto"/>
         <w:rPr>
-          <w:rFonts w:ascii="Times New Roman" w:eastAsia="Google Sans" w:hAnsi="Times New Roman" w:cs="Times New Roman"/>
-          <w:color w:val="1F1F1F"/>
-        </w:rPr>
-      </w:pPr>
-      <w:r>
-        <w:rPr>
-          <w:rFonts w:ascii="Times New Roman" w:eastAsia="Google Sans" w:hAnsi="Times New Roman" w:cs="Times New Roman"/>
+          <w:rFonts w:ascii="Google Sans" w:eastAsia="Google Sans" w:hAnsi="Google Sans" w:cs="Google Sans"/>
+          <w:color w:val="1F1F1F"/>
+        </w:rPr>
+      </w:pPr>
+      <w:r>
+        <w:rPr>
+          <w:rFonts w:ascii="Google Sans" w:eastAsia="Google Sans" w:hAnsi="Google Sans" w:cs="Google Sans"/>
           <w:color w:val="1F1F1F"/>
         </w:rPr>
         <w:t>Work Experience</w:t>
@@ -361,71 +330,57 @@
           <w:right w:val="nil"/>
           <w:between w:val="nil"/>
         </w:pBdr>
-        <w:spacing w:line="275" w:lineRule="auto"/>
-        <w:rPr>
-          <w:rFonts w:ascii="Times New Roman" w:eastAsia="Google Sans" w:hAnsi="Times New Roman" w:cs="Times New Roman"/>
-          <w:color w:val="1F1F1F"/>
-          <w:sz w:val="24"/>
-          <w:szCs w:val="24"/>
-        </w:rPr>
-      </w:pPr>
-      <w:r>
-        <w:rPr>
-          <w:rFonts w:ascii="Times New Roman" w:eastAsia="Google Sans" w:hAnsi="Times New Roman" w:cs="Times New Roman"/>
+        <w:spacing w:after="120" w:line="275" w:lineRule="auto"/>
+        <w:rPr>
+          <w:rFonts w:ascii="Google Sans" w:eastAsia="Google Sans" w:hAnsi="Google Sans" w:cs="Google Sans"/>
+          <w:color w:val="1F1F1F"/>
+        </w:rPr>
+      </w:pPr>
+      <w:r>
+        <w:rPr>
+          <w:rFonts w:ascii="Google Sans" w:eastAsia="Google Sans" w:hAnsi="Google Sans" w:cs="Google Sans"/>
           <w:b/>
           <w:bCs/>
           <w:color w:val="1F1F1F"/>
-          <w:sz w:val="24"/>
-          <w:szCs w:val="24"/>
         </w:rPr>
         <w:t>Electronics Repair Specialist</w:t>
       </w:r>
       <w:r>
         <w:rPr>
-          <w:rFonts w:ascii="Times New Roman" w:eastAsia="Google Sans" w:hAnsi="Times New Roman" w:cs="Times New Roman"/>
-          <w:color w:val="1F1F1F"/>
-          <w:sz w:val="24"/>
-          <w:szCs w:val="24"/>
+          <w:rFonts w:ascii="Google Sans" w:eastAsia="Google Sans" w:hAnsi="Google Sans" w:cs="Google Sans"/>
+          <w:color w:val="1F1F1F"/>
         </w:rPr>
         <w:t xml:space="preserve"> | </w:t>
       </w:r>
       <w:proofErr w:type="spellStart"/>
       <w:r>
         <w:rPr>
-          <w:rFonts w:ascii="Times New Roman" w:eastAsia="Google Sans" w:hAnsi="Times New Roman" w:cs="Times New Roman"/>
-          <w:color w:val="1F1F1F"/>
-          <w:sz w:val="24"/>
-          <w:szCs w:val="24"/>
+          <w:rFonts w:ascii="Google Sans" w:eastAsia="Google Sans" w:hAnsi="Google Sans" w:cs="Google Sans"/>
+          <w:color w:val="1F1F1F"/>
         </w:rPr>
         <w:t>Dr.</w:t>
       </w:r>
       <w:proofErr w:type="spellEnd"/>
       <w:r>
         <w:rPr>
-          <w:rFonts w:ascii="Times New Roman" w:eastAsia="Google Sans" w:hAnsi="Times New Roman" w:cs="Times New Roman"/>
-          <w:color w:val="1F1F1F"/>
-          <w:sz w:val="24"/>
-          <w:szCs w:val="24"/>
+          <w:rFonts w:ascii="Google Sans" w:eastAsia="Google Sans" w:hAnsi="Google Sans" w:cs="Google Sans"/>
+          <w:color w:val="1F1F1F"/>
         </w:rPr>
         <w:t xml:space="preserve"> </w:t>
       </w:r>
       <w:proofErr w:type="spellStart"/>
       <w:r>
         <w:rPr>
-          <w:rFonts w:ascii="Times New Roman" w:eastAsia="Google Sans" w:hAnsi="Times New Roman" w:cs="Times New Roman"/>
-          <w:color w:val="1F1F1F"/>
-          <w:sz w:val="24"/>
-          <w:szCs w:val="24"/>
+          <w:rFonts w:ascii="Google Sans" w:eastAsia="Google Sans" w:hAnsi="Google Sans" w:cs="Google Sans"/>
+          <w:color w:val="1F1F1F"/>
         </w:rPr>
         <w:t>Cellulaire</w:t>
       </w:r>
       <w:proofErr w:type="spellEnd"/>
       <w:r>
         <w:rPr>
-          <w:rFonts w:ascii="Times New Roman" w:eastAsia="Google Sans" w:hAnsi="Times New Roman" w:cs="Times New Roman"/>
-          <w:color w:val="1F1F1F"/>
-          <w:sz w:val="24"/>
-          <w:szCs w:val="24"/>
+          <w:rFonts w:ascii="Google Sans" w:eastAsia="Google Sans" w:hAnsi="Google Sans" w:cs="Google Sans"/>
+          <w:color w:val="1F1F1F"/>
         </w:rPr>
         <w:t xml:space="preserve"> | Machakos, Kenya | Jan 2021 – Present</w:t>
       </w:r>
@@ -444,36 +399,25 @@
           <w:between w:val="nil"/>
         </w:pBdr>
         <w:spacing w:line="275" w:lineRule="auto"/>
-        <w:rPr>
-          <w:rFonts w:ascii="Times New Roman" w:hAnsi="Times New Roman" w:cs="Times New Roman"/>
-          <w:sz w:val="24"/>
-          <w:szCs w:val="24"/>
-        </w:rPr>
-      </w:pPr>
-      <w:r>
-        <w:rPr>
-          <w:rFonts w:ascii="Times New Roman" w:eastAsia="Google Sans" w:hAnsi="Times New Roman" w:cs="Times New Roman"/>
-          <w:color w:val="1F1F1F"/>
-          <w:sz w:val="24"/>
-          <w:szCs w:val="24"/>
+      </w:pPr>
+      <w:r>
+        <w:rPr>
+          <w:rFonts w:ascii="Google Sans" w:eastAsia="Google Sans" w:hAnsi="Google Sans" w:cs="Google Sans"/>
+          <w:color w:val="1F1F1F"/>
         </w:rPr>
         <w:t>Restored 100</w:t>
       </w:r>
       <w:r>
         <w:rPr>
-          <w:rFonts w:ascii="Times New Roman" w:eastAsia="Google Sans" w:hAnsi="Times New Roman" w:cs="Times New Roman"/>
-          <w:color w:val="1F1F1F"/>
-          <w:sz w:val="24"/>
-          <w:szCs w:val="24"/>
+          <w:rFonts w:ascii="Google Sans" w:eastAsia="Google Sans" w:hAnsi="Google Sans" w:cs="Google Sans"/>
+          <w:color w:val="1F1F1F"/>
         </w:rPr>
         <w:t>0</w:t>
       </w:r>
       <w:r>
         <w:rPr>
-          <w:rFonts w:ascii="Times New Roman" w:eastAsia="Google Sans" w:hAnsi="Times New Roman" w:cs="Times New Roman"/>
-          <w:color w:val="1F1F1F"/>
-          <w:sz w:val="24"/>
-          <w:szCs w:val="24"/>
+          <w:rFonts w:ascii="Google Sans" w:eastAsia="Google Sans" w:hAnsi="Google Sans" w:cs="Google Sans"/>
+          <w:color w:val="1F1F1F"/>
         </w:rPr>
         <w:t>+ non-functional devices using component-level diagnostics, schematic tracing, and precision SMD micro-soldering.</w:t>
       </w:r>
@@ -492,20 +436,20 @@
           <w:between w:val="nil"/>
         </w:pBdr>
         <w:spacing w:after="120" w:line="275" w:lineRule="auto"/>
-        <w:rPr>
-          <w:rFonts w:ascii="Times New Roman" w:hAnsi="Times New Roman" w:cs="Times New Roman"/>
-          <w:sz w:val="24"/>
-          <w:szCs w:val="24"/>
-        </w:rPr>
-      </w:pPr>
-      <w:r>
-        <w:rPr>
-          <w:rFonts w:ascii="Times New Roman" w:eastAsia="Google Sans" w:hAnsi="Times New Roman" w:cs="Times New Roman"/>
-          <w:color w:val="1F1F1F"/>
-          <w:sz w:val="24"/>
-          <w:szCs w:val="24"/>
-        </w:rPr>
-        <w:t>Streamlined repair workflows and managed inventory, achieving high customer satisfaction across independent service operations.</w:t>
+      </w:pPr>
+      <w:r>
+        <w:rPr>
+          <w:rFonts w:ascii="Google Sans" w:eastAsia="Google Sans" w:hAnsi="Google Sans" w:cs="Google Sans"/>
+          <w:color w:val="1F1F1F"/>
+        </w:rPr>
+        <w:t>Streamlined repair workflows and managed inventory, achieving high custom</w:t>
+      </w:r>
+      <w:r>
+        <w:rPr>
+          <w:rFonts w:ascii="Google Sans" w:eastAsia="Google Sans" w:hAnsi="Google Sans" w:cs="Google Sans"/>
+          <w:color w:val="1F1F1F"/>
+        </w:rPr>
+        <w:t>er satisfaction across independent service operations.</w:t>
       </w:r>
     </w:p>
     <w:p>
@@ -517,33 +461,34 @@
           <w:right w:val="nil"/>
           <w:between w:val="nil"/>
         </w:pBdr>
-        <w:spacing w:before="120" w:line="275" w:lineRule="auto"/>
-        <w:rPr>
-          <w:rFonts w:ascii="Times New Roman" w:eastAsia="Google Sans" w:hAnsi="Times New Roman" w:cs="Times New Roman"/>
-          <w:color w:val="1F1F1F"/>
-          <w:sz w:val="24"/>
-          <w:szCs w:val="24"/>
-        </w:rPr>
-      </w:pPr>
-      <w:r>
-        <w:rPr>
-          <w:rFonts w:ascii="Times New Roman" w:eastAsia="Google Sans" w:hAnsi="Times New Roman" w:cs="Times New Roman"/>
+        <w:spacing w:before="120" w:after="120" w:line="275" w:lineRule="auto"/>
+        <w:rPr>
+          <w:rFonts w:ascii="Google Sans" w:eastAsia="Google Sans" w:hAnsi="Google Sans" w:cs="Google Sans"/>
+          <w:color w:val="1F1F1F"/>
+        </w:rPr>
+      </w:pPr>
+      <w:r>
+        <w:rPr>
+          <w:rFonts w:ascii="Google Sans" w:eastAsia="Google Sans" w:hAnsi="Google Sans" w:cs="Google Sans"/>
           <w:b/>
           <w:bCs/>
           <w:color w:val="1F1F1F"/>
-          <w:sz w:val="24"/>
-          <w:szCs w:val="24"/>
         </w:rPr>
         <w:t>STEM Educator &amp; KSEF Project Advisor</w:t>
       </w:r>
       <w:r>
         <w:rPr>
-          <w:rFonts w:ascii="Times New Roman" w:eastAsia="Google Sans" w:hAnsi="Times New Roman" w:cs="Times New Roman"/>
-          <w:color w:val="1F1F1F"/>
-          <w:sz w:val="24"/>
-          <w:szCs w:val="24"/>
-        </w:rPr>
-        <w:t xml:space="preserve"> | Lukenya Boys High School | Feb 2026 – Mar 2026</w:t>
+          <w:rFonts w:ascii="Google Sans" w:eastAsia="Google Sans" w:hAnsi="Google Sans" w:cs="Google Sans"/>
+          <w:color w:val="1F1F1F"/>
+        </w:rPr>
+        <w:t xml:space="preserve"> | Lukenya Boys High School </w:t>
+      </w:r>
+      <w:r>
+        <w:rPr>
+          <w:rFonts w:ascii="Google Sans" w:eastAsia="Google Sans" w:hAnsi="Google Sans" w:cs="Google Sans"/>
+          <w:color w:val="1F1F1F"/>
+        </w:rPr>
+        <w:t>| Feb 2026 – Mar 2026</w:t>
       </w:r>
     </w:p>
     <w:p>
@@ -560,18 +505,11 @@
           <w:between w:val="nil"/>
         </w:pBdr>
         <w:spacing w:line="275" w:lineRule="auto"/>
-        <w:rPr>
-          <w:rFonts w:ascii="Times New Roman" w:hAnsi="Times New Roman" w:cs="Times New Roman"/>
-          <w:sz w:val="24"/>
-          <w:szCs w:val="24"/>
-        </w:rPr>
-      </w:pPr>
-      <w:r>
-        <w:rPr>
-          <w:rFonts w:ascii="Times New Roman" w:eastAsia="Google Sans" w:hAnsi="Times New Roman" w:cs="Times New Roman"/>
-          <w:color w:val="1F1F1F"/>
-          <w:sz w:val="24"/>
-          <w:szCs w:val="24"/>
+      </w:pPr>
+      <w:r>
+        <w:rPr>
+          <w:rFonts w:ascii="Google Sans" w:eastAsia="Google Sans" w:hAnsi="Google Sans" w:cs="Google Sans"/>
+          <w:color w:val="1F1F1F"/>
         </w:rPr>
         <w:t>Directed hardware engineering initiatives, guiding students to successfully build and test a Minimum Viable Product.</w:t>
       </w:r>
@@ -590,18 +528,11 @@
           <w:between w:val="nil"/>
         </w:pBdr>
         <w:spacing w:after="120" w:line="275" w:lineRule="auto"/>
-        <w:rPr>
-          <w:rFonts w:ascii="Times New Roman" w:hAnsi="Times New Roman" w:cs="Times New Roman"/>
-          <w:sz w:val="24"/>
-          <w:szCs w:val="24"/>
-        </w:rPr>
-      </w:pPr>
-      <w:r>
-        <w:rPr>
-          <w:rFonts w:ascii="Times New Roman" w:eastAsia="Google Sans" w:hAnsi="Times New Roman" w:cs="Times New Roman"/>
-          <w:color w:val="1F1F1F"/>
-          <w:sz w:val="24"/>
-          <w:szCs w:val="24"/>
+      </w:pPr>
+      <w:r>
+        <w:rPr>
+          <w:rFonts w:ascii="Google Sans" w:eastAsia="Google Sans" w:hAnsi="Google Sans" w:cs="Google Sans"/>
+          <w:color w:val="1F1F1F"/>
         </w:rPr>
         <w:t>Mentored teams in rapid prototyping and iterative design, delivering functional projects under strict exhibition deadlines.</w:t>
       </w:r>
@@ -615,31 +546,34 @@
           <w:right w:val="nil"/>
           <w:between w:val="nil"/>
         </w:pBdr>
-        <w:spacing w:before="120" w:line="275" w:lineRule="auto"/>
-        <w:rPr>
-          <w:rFonts w:ascii="Times New Roman" w:eastAsia="Google Sans" w:hAnsi="Times New Roman" w:cs="Times New Roman"/>
-          <w:color w:val="1F1F1F"/>
-          <w:sz w:val="24"/>
-          <w:szCs w:val="24"/>
-        </w:rPr>
-      </w:pPr>
-      <w:r>
-        <w:rPr>
-          <w:rFonts w:ascii="Times New Roman" w:eastAsia="Google Sans" w:hAnsi="Times New Roman" w:cs="Times New Roman"/>
+        <w:spacing w:before="120" w:after="120" w:line="275" w:lineRule="auto"/>
+        <w:rPr>
+          <w:rFonts w:ascii="Google Sans" w:eastAsia="Google Sans" w:hAnsi="Google Sans" w:cs="Google Sans"/>
+          <w:color w:val="1F1F1F"/>
+        </w:rPr>
+      </w:pPr>
+      <w:r>
+        <w:rPr>
+          <w:rFonts w:ascii="Google Sans" w:eastAsia="Google Sans" w:hAnsi="Google Sans" w:cs="Google Sans"/>
           <w:b/>
           <w:bCs/>
           <w:color w:val="1F1F1F"/>
-          <w:sz w:val="24"/>
-          <w:szCs w:val="24"/>
-        </w:rPr>
-        <w:t>Industrial Attaché</w:t>
-      </w:r>
-      <w:r>
-        <w:rPr>
-          <w:rFonts w:ascii="Times New Roman" w:eastAsia="Google Sans" w:hAnsi="Times New Roman" w:cs="Times New Roman"/>
-          <w:color w:val="1F1F1F"/>
-          <w:sz w:val="24"/>
-          <w:szCs w:val="24"/>
+        </w:rPr>
+        <w:t>Industrial Atta</w:t>
+      </w:r>
+      <w:r>
+        <w:rPr>
+          <w:rFonts w:ascii="Google Sans" w:eastAsia="Google Sans" w:hAnsi="Google Sans" w:cs="Google Sans"/>
+          <w:b/>
+          <w:bCs/>
+          <w:color w:val="1F1F1F"/>
+        </w:rPr>
+        <w:t>ché</w:t>
+      </w:r>
+      <w:r>
+        <w:rPr>
+          <w:rFonts w:ascii="Google Sans" w:eastAsia="Google Sans" w:hAnsi="Google Sans" w:cs="Google Sans"/>
+          <w:color w:val="1F1F1F"/>
         </w:rPr>
         <w:t xml:space="preserve"> | Kenya Civil Aviation Authority (KCAA) | Mombasa, Kenya | Jun 2025 – Aug 2025</w:t>
       </w:r>
@@ -658,18 +592,11 @@
           <w:between w:val="nil"/>
         </w:pBdr>
         <w:spacing w:line="275" w:lineRule="auto"/>
-        <w:rPr>
-          <w:rFonts w:ascii="Times New Roman" w:hAnsi="Times New Roman" w:cs="Times New Roman"/>
-          <w:sz w:val="24"/>
-          <w:szCs w:val="24"/>
-        </w:rPr>
-      </w:pPr>
-      <w:r>
-        <w:rPr>
-          <w:rFonts w:ascii="Times New Roman" w:eastAsia="Google Sans" w:hAnsi="Times New Roman" w:cs="Times New Roman"/>
-          <w:color w:val="1F1F1F"/>
-          <w:sz w:val="24"/>
-          <w:szCs w:val="24"/>
+      </w:pPr>
+      <w:r>
+        <w:rPr>
+          <w:rFonts w:ascii="Google Sans" w:eastAsia="Google Sans" w:hAnsi="Google Sans" w:cs="Google Sans"/>
+          <w:color w:val="1F1F1F"/>
         </w:rPr>
         <w:lastRenderedPageBreak/>
         <w:t>Executed RF signal integrity and VSWR assessments using spectrum analyzers to ensure optimal transmission quality.</w:t>
@@ -689,18 +616,11 @@
           <w:between w:val="nil"/>
         </w:pBdr>
         <w:spacing w:after="120" w:line="275" w:lineRule="auto"/>
-        <w:rPr>
-          <w:rFonts w:ascii="Times New Roman" w:hAnsi="Times New Roman" w:cs="Times New Roman"/>
-          <w:sz w:val="24"/>
-          <w:szCs w:val="24"/>
-        </w:rPr>
-      </w:pPr>
-      <w:r>
-        <w:rPr>
-          <w:rFonts w:ascii="Times New Roman" w:eastAsia="Google Sans" w:hAnsi="Times New Roman" w:cs="Times New Roman"/>
-          <w:color w:val="1F1F1F"/>
-          <w:sz w:val="24"/>
-          <w:szCs w:val="24"/>
+      </w:pPr>
+      <w:r>
+        <w:rPr>
+          <w:rFonts w:ascii="Google Sans" w:eastAsia="Google Sans" w:hAnsi="Google Sans" w:cs="Google Sans"/>
+          <w:color w:val="1F1F1F"/>
         </w:rPr>
         <w:t>Collaborated with senior engineers to isolate transmission faults, successfully minimizing critical communication downtime.</w:t>
       </w:r>
@@ -714,44 +634,36 @@
           <w:right w:val="nil"/>
           <w:between w:val="nil"/>
         </w:pBdr>
-        <w:spacing w:before="120" w:line="275" w:lineRule="auto"/>
-        <w:rPr>
-          <w:rFonts w:ascii="Times New Roman" w:eastAsia="Google Sans" w:hAnsi="Times New Roman" w:cs="Times New Roman"/>
-          <w:color w:val="1F1F1F"/>
-          <w:sz w:val="24"/>
-          <w:szCs w:val="24"/>
-        </w:rPr>
-      </w:pPr>
-      <w:r>
-        <w:rPr>
-          <w:rFonts w:ascii="Times New Roman" w:eastAsia="Google Sans" w:hAnsi="Times New Roman" w:cs="Times New Roman"/>
+        <w:spacing w:before="120" w:after="120" w:line="275" w:lineRule="auto"/>
+        <w:rPr>
+          <w:rFonts w:ascii="Google Sans" w:eastAsia="Google Sans" w:hAnsi="Google Sans" w:cs="Google Sans"/>
+          <w:color w:val="1F1F1F"/>
+        </w:rPr>
+      </w:pPr>
+      <w:r>
+        <w:rPr>
+          <w:rFonts w:ascii="Google Sans" w:eastAsia="Google Sans" w:hAnsi="Google Sans" w:cs="Google Sans"/>
           <w:b/>
           <w:bCs/>
           <w:color w:val="1F1F1F"/>
-          <w:sz w:val="24"/>
-          <w:szCs w:val="24"/>
         </w:rPr>
         <w:t xml:space="preserve">Arduino </w:t>
       </w:r>
       <w:proofErr w:type="gramStart"/>
       <w:r>
         <w:rPr>
-          <w:rFonts w:ascii="Times New Roman" w:eastAsia="Google Sans" w:hAnsi="Times New Roman" w:cs="Times New Roman"/>
+          <w:rFonts w:ascii="Google Sans" w:eastAsia="Google Sans" w:hAnsi="Google Sans" w:cs="Google Sans"/>
           <w:b/>
           <w:bCs/>
           <w:color w:val="1F1F1F"/>
-          <w:sz w:val="24"/>
-          <w:szCs w:val="24"/>
         </w:rPr>
         <w:t>Lead</w:t>
       </w:r>
       <w:proofErr w:type="gramEnd"/>
       <w:r>
         <w:rPr>
-          <w:rFonts w:ascii="Times New Roman" w:eastAsia="Google Sans" w:hAnsi="Times New Roman" w:cs="Times New Roman"/>
-          <w:color w:val="1F1F1F"/>
-          <w:sz w:val="24"/>
-          <w:szCs w:val="24"/>
+          <w:rFonts w:ascii="Google Sans" w:eastAsia="Google Sans" w:hAnsi="Google Sans" w:cs="Google Sans"/>
+          <w:color w:val="1F1F1F"/>
         </w:rPr>
         <w:t xml:space="preserve"> | Techno Engineering Association | Machakos, Kenya | Jan 2024 – Dec 2024</w:t>
       </w:r>
@@ -770,20 +682,20 @@
           <w:between w:val="nil"/>
         </w:pBdr>
         <w:spacing w:line="275" w:lineRule="auto"/>
-        <w:rPr>
-          <w:rFonts w:ascii="Times New Roman" w:hAnsi="Times New Roman" w:cs="Times New Roman"/>
-          <w:sz w:val="24"/>
-          <w:szCs w:val="24"/>
-        </w:rPr>
-      </w:pPr>
-      <w:r>
-        <w:rPr>
-          <w:rFonts w:ascii="Times New Roman" w:eastAsia="Google Sans" w:hAnsi="Times New Roman" w:cs="Times New Roman"/>
-          <w:color w:val="1F1F1F"/>
-          <w:sz w:val="24"/>
-          <w:szCs w:val="24"/>
-        </w:rPr>
-        <w:t>Mentored 50+ engineering students in microcontroller debugging, bridging circuit theory with functional sensor integration.</w:t>
+      </w:pPr>
+      <w:r>
+        <w:rPr>
+          <w:rFonts w:ascii="Google Sans" w:eastAsia="Google Sans" w:hAnsi="Google Sans" w:cs="Google Sans"/>
+          <w:color w:val="1F1F1F"/>
+        </w:rPr>
+        <w:t>Mentored 50+ engineering students in microcont</w:t>
+      </w:r>
+      <w:r>
+        <w:rPr>
+          <w:rFonts w:ascii="Google Sans" w:eastAsia="Google Sans" w:hAnsi="Google Sans" w:cs="Google Sans"/>
+          <w:color w:val="1F1F1F"/>
+        </w:rPr>
+        <w:t>roller debugging, bridging circuit theory with functional sensor integration.</w:t>
       </w:r>
     </w:p>
     <w:p>
@@ -800,18 +712,11 @@
           <w:between w:val="nil"/>
         </w:pBdr>
         <w:spacing w:after="120" w:line="275" w:lineRule="auto"/>
-        <w:rPr>
-          <w:rFonts w:ascii="Times New Roman" w:hAnsi="Times New Roman" w:cs="Times New Roman"/>
-          <w:sz w:val="24"/>
-          <w:szCs w:val="24"/>
-        </w:rPr>
-      </w:pPr>
-      <w:r>
-        <w:rPr>
-          <w:rFonts w:ascii="Times New Roman" w:eastAsia="Google Sans" w:hAnsi="Times New Roman" w:cs="Times New Roman"/>
-          <w:color w:val="1F1F1F"/>
-          <w:sz w:val="24"/>
-          <w:szCs w:val="24"/>
+      </w:pPr>
+      <w:r>
+        <w:rPr>
+          <w:rFonts w:ascii="Google Sans" w:eastAsia="Google Sans" w:hAnsi="Google Sans" w:cs="Google Sans"/>
+          <w:color w:val="1F1F1F"/>
         </w:rPr>
         <w:t>Led practical sessions on embedded C programming, hardware prototyping, and sensor deployment for university peers.</w:t>
       </w:r>
@@ -825,53 +730,70 @@
           <w:right w:val="nil"/>
           <w:between w:val="nil"/>
         </w:pBdr>
-        <w:spacing w:before="120" w:line="275" w:lineRule="auto"/>
-        <w:rPr>
-          <w:rFonts w:ascii="Times New Roman" w:eastAsia="Google Sans" w:hAnsi="Times New Roman" w:cs="Times New Roman"/>
-          <w:color w:val="1F1F1F"/>
-          <w:sz w:val="24"/>
-          <w:szCs w:val="24"/>
-        </w:rPr>
-      </w:pPr>
-      <w:r>
-        <w:rPr>
-          <w:rFonts w:ascii="Times New Roman" w:eastAsia="Google Sans" w:hAnsi="Times New Roman" w:cs="Times New Roman"/>
+        <w:spacing w:before="120" w:after="120" w:line="275" w:lineRule="auto"/>
+        <w:rPr>
+          <w:rFonts w:ascii="Google Sans" w:eastAsia="Google Sans" w:hAnsi="Google Sans" w:cs="Google Sans"/>
+          <w:color w:val="1F1F1F"/>
+        </w:rPr>
+      </w:pPr>
+      <w:r>
+        <w:rPr>
+          <w:rFonts w:ascii="Google Sans" w:eastAsia="Google Sans" w:hAnsi="Google Sans" w:cs="Google Sans"/>
           <w:b/>
           <w:bCs/>
           <w:color w:val="1F1F1F"/>
-          <w:sz w:val="24"/>
-          <w:szCs w:val="24"/>
-        </w:rPr>
-        <w:t>Technical Attaché</w:t>
-      </w:r>
-      <w:r>
-        <w:rPr>
-          <w:rFonts w:ascii="Times New Roman" w:eastAsia="Google Sans" w:hAnsi="Times New Roman" w:cs="Times New Roman"/>
-          <w:color w:val="1F1F1F"/>
-          <w:sz w:val="24"/>
-          <w:szCs w:val="24"/>
+        </w:rPr>
+        <w:t xml:space="preserve">Technical </w:t>
+      </w:r>
+      <w:proofErr w:type="spellStart"/>
+      <w:r>
+        <w:rPr>
+          <w:rFonts w:ascii="Google Sans" w:eastAsia="Google Sans" w:hAnsi="Google Sans" w:cs="Google Sans"/>
+          <w:b/>
+          <w:bCs/>
+          <w:color w:val="1F1F1F"/>
+        </w:rPr>
+        <w:t>Attache</w:t>
+      </w:r>
+      <w:proofErr w:type="spellEnd"/>
+      <w:r>
+        <w:rPr>
+          <w:rFonts w:ascii="Google Sans" w:eastAsia="Google Sans" w:hAnsi="Google Sans" w:cs="Google Sans"/>
+          <w:b/>
+          <w:bCs/>
+          <w:color w:val="1F1F1F"/>
+        </w:rPr>
+        <w:t>'</w:t>
+      </w:r>
+      <w:r>
+        <w:rPr>
+          <w:rFonts w:ascii="Google Sans" w:eastAsia="Google Sans" w:hAnsi="Google Sans" w:cs="Google Sans"/>
+          <w:color w:val="1F1F1F"/>
         </w:rPr>
         <w:t xml:space="preserve"> | Carl Care Service Center | </w:t>
       </w:r>
       <w:proofErr w:type="spellStart"/>
       <w:r>
         <w:rPr>
-          <w:rFonts w:ascii="Times New Roman" w:eastAsia="Google Sans" w:hAnsi="Times New Roman" w:cs="Times New Roman"/>
-          <w:color w:val="1F1F1F"/>
-          <w:sz w:val="24"/>
-          <w:szCs w:val="24"/>
+          <w:rFonts w:ascii="Google Sans" w:eastAsia="Google Sans" w:hAnsi="Google Sans" w:cs="Google Sans"/>
+          <w:color w:val="1F1F1F"/>
         </w:rPr>
         <w:t>Kitengela</w:t>
       </w:r>
       <w:proofErr w:type="spellEnd"/>
       <w:r>
         <w:rPr>
-          <w:rFonts w:ascii="Times New Roman" w:eastAsia="Google Sans" w:hAnsi="Times New Roman" w:cs="Times New Roman"/>
-          <w:color w:val="1F1F1F"/>
-          <w:sz w:val="24"/>
-          <w:szCs w:val="24"/>
-        </w:rPr>
-        <w:t>, Kenya | Jun 2023 – Aug 2023</w:t>
+          <w:rFonts w:ascii="Google Sans" w:eastAsia="Google Sans" w:hAnsi="Google Sans" w:cs="Google Sans"/>
+          <w:color w:val="1F1F1F"/>
+        </w:rPr>
+        <w:t>, Ken</w:t>
+      </w:r>
+      <w:r>
+        <w:rPr>
+          <w:rFonts w:ascii="Google Sans" w:eastAsia="Google Sans" w:hAnsi="Google Sans" w:cs="Google Sans"/>
+          <w:color w:val="1F1F1F"/>
+        </w:rPr>
+        <w:t>ya | Jun 2023 – Aug 2023</w:t>
       </w:r>
     </w:p>
     <w:p>
@@ -888,18 +810,11 @@
           <w:between w:val="nil"/>
         </w:pBdr>
         <w:spacing w:line="275" w:lineRule="auto"/>
-        <w:rPr>
-          <w:rFonts w:ascii="Times New Roman" w:hAnsi="Times New Roman" w:cs="Times New Roman"/>
-          <w:sz w:val="24"/>
-          <w:szCs w:val="24"/>
-        </w:rPr>
-      </w:pPr>
-      <w:r>
-        <w:rPr>
-          <w:rFonts w:ascii="Times New Roman" w:eastAsia="Google Sans" w:hAnsi="Times New Roman" w:cs="Times New Roman"/>
-          <w:color w:val="1F1F1F"/>
-          <w:sz w:val="24"/>
-          <w:szCs w:val="24"/>
+      </w:pPr>
+      <w:r>
+        <w:rPr>
+          <w:rFonts w:ascii="Google Sans" w:eastAsia="Google Sans" w:hAnsi="Google Sans" w:cs="Google Sans"/>
+          <w:color w:val="1F1F1F"/>
         </w:rPr>
         <w:t>Diagnosed consumer electronics using manufacturer schematics and multimeters, adhering to strict quality assurance standards.</w:t>
       </w:r>
@@ -918,18 +833,11 @@
           <w:between w:val="nil"/>
         </w:pBdr>
         <w:spacing w:after="120" w:line="275" w:lineRule="auto"/>
-        <w:rPr>
-          <w:rFonts w:ascii="Times New Roman" w:hAnsi="Times New Roman" w:cs="Times New Roman"/>
-          <w:sz w:val="24"/>
-          <w:szCs w:val="24"/>
-        </w:rPr>
-      </w:pPr>
-      <w:r>
-        <w:rPr>
-          <w:rFonts w:ascii="Times New Roman" w:eastAsia="Google Sans" w:hAnsi="Times New Roman" w:cs="Times New Roman"/>
-          <w:color w:val="1F1F1F"/>
-          <w:sz w:val="24"/>
-          <w:szCs w:val="24"/>
+      </w:pPr>
+      <w:r>
+        <w:rPr>
+          <w:rFonts w:ascii="Google Sans" w:eastAsia="Google Sans" w:hAnsi="Google Sans" w:cs="Google Sans"/>
+          <w:color w:val="1F1F1F"/>
         </w:rPr>
         <w:t>Documented recurring hardware faults, contributing directly to improved diagnostic workflow efficiency for the team.</w:t>
       </w:r>
@@ -943,31 +851,34 @@
           <w:right w:val="nil"/>
           <w:between w:val="nil"/>
         </w:pBdr>
-        <w:spacing w:before="120" w:line="275" w:lineRule="auto"/>
-        <w:rPr>
-          <w:rFonts w:ascii="Times New Roman" w:eastAsia="Google Sans" w:hAnsi="Times New Roman" w:cs="Times New Roman"/>
-          <w:color w:val="1F1F1F"/>
-          <w:sz w:val="24"/>
-          <w:szCs w:val="24"/>
-        </w:rPr>
-      </w:pPr>
-      <w:r>
-        <w:rPr>
-          <w:rFonts w:ascii="Times New Roman" w:eastAsia="Google Sans" w:hAnsi="Times New Roman" w:cs="Times New Roman"/>
+        <w:spacing w:before="120" w:after="120" w:line="275" w:lineRule="auto"/>
+        <w:rPr>
+          <w:rFonts w:ascii="Google Sans" w:eastAsia="Google Sans" w:hAnsi="Google Sans" w:cs="Google Sans"/>
+          <w:color w:val="1F1F1F"/>
+        </w:rPr>
+      </w:pPr>
+      <w:r>
+        <w:rPr>
+          <w:rFonts w:ascii="Google Sans" w:eastAsia="Google Sans" w:hAnsi="Google Sans" w:cs="Google Sans"/>
           <w:b/>
           <w:bCs/>
           <w:color w:val="1F1F1F"/>
-          <w:sz w:val="24"/>
-          <w:szCs w:val="24"/>
-        </w:rPr>
-        <w:t>Domestic Electrical Installer</w:t>
-      </w:r>
-      <w:r>
-        <w:rPr>
-          <w:rFonts w:ascii="Times New Roman" w:eastAsia="Google Sans" w:hAnsi="Times New Roman" w:cs="Times New Roman"/>
-          <w:color w:val="1F1F1F"/>
-          <w:sz w:val="24"/>
-          <w:szCs w:val="24"/>
+        </w:rPr>
+        <w:t>Domestic Elec</w:t>
+      </w:r>
+      <w:r>
+        <w:rPr>
+          <w:rFonts w:ascii="Google Sans" w:eastAsia="Google Sans" w:hAnsi="Google Sans" w:cs="Google Sans"/>
+          <w:b/>
+          <w:bCs/>
+          <w:color w:val="1F1F1F"/>
+        </w:rPr>
+        <w:t>trical Installer</w:t>
+      </w:r>
+      <w:r>
+        <w:rPr>
+          <w:rFonts w:ascii="Google Sans" w:eastAsia="Google Sans" w:hAnsi="Google Sans" w:cs="Google Sans"/>
+          <w:color w:val="1F1F1F"/>
         </w:rPr>
         <w:t xml:space="preserve"> | Freelance | Dec 2019 – Aug 2020</w:t>
       </w:r>
@@ -986,18 +897,11 @@
           <w:between w:val="nil"/>
         </w:pBdr>
         <w:spacing w:after="120" w:line="275" w:lineRule="auto"/>
-        <w:rPr>
-          <w:rFonts w:ascii="Times New Roman" w:hAnsi="Times New Roman" w:cs="Times New Roman"/>
-          <w:sz w:val="24"/>
-          <w:szCs w:val="24"/>
-        </w:rPr>
-      </w:pPr>
-      <w:r>
-        <w:rPr>
-          <w:rFonts w:ascii="Times New Roman" w:eastAsia="Google Sans" w:hAnsi="Times New Roman" w:cs="Times New Roman"/>
-          <w:color w:val="1F1F1F"/>
-          <w:sz w:val="24"/>
-          <w:szCs w:val="24"/>
+      </w:pPr>
+      <w:r>
+        <w:rPr>
+          <w:rFonts w:ascii="Google Sans" w:eastAsia="Google Sans" w:hAnsi="Google Sans" w:cs="Google Sans"/>
+          <w:color w:val="1F1F1F"/>
         </w:rPr>
         <w:t>Managed comprehensive domestic electrical installations, ensuring 100% compliance with standard safety regulations.</w:t>
       </w:r>
@@ -1007,13 +911,13 @@
         <w:pStyle w:val="Heading2"/>
         <w:spacing w:before="120" w:after="120" w:line="275" w:lineRule="auto"/>
         <w:rPr>
-          <w:rFonts w:ascii="Times New Roman" w:eastAsia="Google Sans" w:hAnsi="Times New Roman" w:cs="Times New Roman"/>
-          <w:color w:val="1F1F1F"/>
-        </w:rPr>
-      </w:pPr>
-      <w:r>
-        <w:rPr>
-          <w:rFonts w:ascii="Times New Roman" w:eastAsia="Google Sans" w:hAnsi="Times New Roman" w:cs="Times New Roman"/>
+          <w:rFonts w:ascii="Google Sans" w:eastAsia="Google Sans" w:hAnsi="Google Sans" w:cs="Google Sans"/>
+          <w:color w:val="1F1F1F"/>
+        </w:rPr>
+      </w:pPr>
+      <w:r>
+        <w:rPr>
+          <w:rFonts w:ascii="Google Sans" w:eastAsia="Google Sans" w:hAnsi="Google Sans" w:cs="Google Sans"/>
           <w:color w:val="1F1F1F"/>
         </w:rPr>
         <w:t>Projects</w:t>
@@ -1030,29 +934,23 @@
         </w:pBdr>
         <w:spacing w:line="275" w:lineRule="auto"/>
         <w:rPr>
-          <w:rFonts w:ascii="Times New Roman" w:eastAsia="Google Sans" w:hAnsi="Times New Roman" w:cs="Times New Roman"/>
-          <w:color w:val="1F1F1F"/>
-          <w:sz w:val="24"/>
-          <w:szCs w:val="24"/>
-        </w:rPr>
-      </w:pPr>
-      <w:r>
-        <w:rPr>
-          <w:rFonts w:ascii="Times New Roman" w:eastAsia="Google Sans" w:hAnsi="Times New Roman" w:cs="Times New Roman"/>
+          <w:rFonts w:ascii="Google Sans" w:eastAsia="Google Sans" w:hAnsi="Google Sans" w:cs="Google Sans"/>
+          <w:color w:val="1F1F1F"/>
+        </w:rPr>
+      </w:pPr>
+      <w:r>
+        <w:rPr>
+          <w:rFonts w:ascii="Google Sans" w:eastAsia="Google Sans" w:hAnsi="Google Sans" w:cs="Google Sans"/>
           <w:b/>
           <w:bCs/>
           <w:color w:val="1F1F1F"/>
-          <w:sz w:val="24"/>
-          <w:szCs w:val="24"/>
         </w:rPr>
         <w:t>Visible Light Communication (VLC) Transceiver</w:t>
       </w:r>
       <w:r>
         <w:rPr>
-          <w:rFonts w:ascii="Times New Roman" w:eastAsia="Google Sans" w:hAnsi="Times New Roman" w:cs="Times New Roman"/>
-          <w:color w:val="1F1F1F"/>
-          <w:sz w:val="24"/>
-          <w:szCs w:val="24"/>
+          <w:rFonts w:ascii="Google Sans" w:eastAsia="Google Sans" w:hAnsi="Google Sans" w:cs="Google Sans"/>
+          <w:color w:val="1F1F1F"/>
         </w:rPr>
         <w:t xml:space="preserve"> | Feb 2026 – Present</w:t>
       </w:r>
@@ -1071,18 +969,11 @@
           <w:between w:val="nil"/>
         </w:pBdr>
         <w:spacing w:line="275" w:lineRule="auto"/>
-        <w:rPr>
-          <w:rFonts w:ascii="Times New Roman" w:hAnsi="Times New Roman" w:cs="Times New Roman"/>
-          <w:sz w:val="24"/>
-          <w:szCs w:val="24"/>
-        </w:rPr>
-      </w:pPr>
-      <w:r>
-        <w:rPr>
-          <w:rFonts w:ascii="Times New Roman" w:eastAsia="Google Sans" w:hAnsi="Times New Roman" w:cs="Times New Roman"/>
-          <w:color w:val="1F1F1F"/>
-          <w:sz w:val="24"/>
-          <w:szCs w:val="24"/>
+      </w:pPr>
+      <w:r>
+        <w:rPr>
+          <w:rFonts w:ascii="Google Sans" w:eastAsia="Google Sans" w:hAnsi="Google Sans" w:cs="Google Sans"/>
+          <w:color w:val="1F1F1F"/>
         </w:rPr>
         <w:t>Designed and built a real-time VLC transceiver for wireless optical data transmission via high-speed LED modulation.</w:t>
       </w:r>
@@ -1101,18 +992,11 @@
           <w:between w:val="nil"/>
         </w:pBdr>
         <w:spacing w:after="120" w:line="275" w:lineRule="auto"/>
-        <w:rPr>
-          <w:rFonts w:ascii="Times New Roman" w:hAnsi="Times New Roman" w:cs="Times New Roman"/>
-          <w:sz w:val="24"/>
-          <w:szCs w:val="24"/>
-        </w:rPr>
-      </w:pPr>
-      <w:r>
-        <w:rPr>
-          <w:rFonts w:ascii="Times New Roman" w:eastAsia="Google Sans" w:hAnsi="Times New Roman" w:cs="Times New Roman"/>
-          <w:color w:val="1F1F1F"/>
-          <w:sz w:val="24"/>
-          <w:szCs w:val="24"/>
+      </w:pPr>
+      <w:r>
+        <w:rPr>
+          <w:rFonts w:ascii="Google Sans" w:eastAsia="Google Sans" w:hAnsi="Google Sans" w:cs="Google Sans"/>
+          <w:color w:val="1F1F1F"/>
         </w:rPr>
         <w:t>Developed an analog optical receiver front-end (BPW34 photodiode, OPA380 amplifier) for MHz-range light signal conditioning.</w:t>
       </w:r>
@@ -1128,29 +1012,23 @@
         </w:pBdr>
         <w:spacing w:line="275" w:lineRule="auto"/>
         <w:rPr>
-          <w:rFonts w:ascii="Times New Roman" w:eastAsia="Google Sans" w:hAnsi="Times New Roman" w:cs="Times New Roman"/>
-          <w:color w:val="1F1F1F"/>
-          <w:sz w:val="24"/>
-          <w:szCs w:val="24"/>
-        </w:rPr>
-      </w:pPr>
-      <w:r>
-        <w:rPr>
-          <w:rFonts w:ascii="Times New Roman" w:eastAsia="Google Sans" w:hAnsi="Times New Roman" w:cs="Times New Roman"/>
+          <w:rFonts w:ascii="Google Sans" w:eastAsia="Google Sans" w:hAnsi="Google Sans" w:cs="Google Sans"/>
+          <w:color w:val="1F1F1F"/>
+        </w:rPr>
+      </w:pPr>
+      <w:r>
+        <w:rPr>
+          <w:rFonts w:ascii="Google Sans" w:eastAsia="Google Sans" w:hAnsi="Google Sans" w:cs="Google Sans"/>
           <w:b/>
           <w:bCs/>
           <w:color w:val="1F1F1F"/>
-          <w:sz w:val="24"/>
-          <w:szCs w:val="24"/>
         </w:rPr>
         <w:t>Underground Cable Fault Detection System</w:t>
       </w:r>
       <w:r>
         <w:rPr>
-          <w:rFonts w:ascii="Times New Roman" w:eastAsia="Google Sans" w:hAnsi="Times New Roman" w:cs="Times New Roman"/>
-          <w:color w:val="1F1F1F"/>
-          <w:sz w:val="24"/>
-          <w:szCs w:val="24"/>
+          <w:rFonts w:ascii="Google Sans" w:eastAsia="Google Sans" w:hAnsi="Google Sans" w:cs="Google Sans"/>
+          <w:color w:val="1F1F1F"/>
         </w:rPr>
         <w:t xml:space="preserve"> | Jan 2025 – Mar 2025</w:t>
       </w:r>
@@ -1169,18 +1047,11 @@
           <w:between w:val="nil"/>
         </w:pBdr>
         <w:spacing w:line="275" w:lineRule="auto"/>
-        <w:rPr>
-          <w:rFonts w:ascii="Times New Roman" w:hAnsi="Times New Roman" w:cs="Times New Roman"/>
-          <w:sz w:val="24"/>
-          <w:szCs w:val="24"/>
-        </w:rPr>
-      </w:pPr>
-      <w:r>
-        <w:rPr>
-          <w:rFonts w:ascii="Times New Roman" w:eastAsia="Google Sans" w:hAnsi="Times New Roman" w:cs="Times New Roman"/>
-          <w:color w:val="1F1F1F"/>
-          <w:sz w:val="24"/>
-          <w:szCs w:val="24"/>
+      </w:pPr>
+      <w:r>
+        <w:rPr>
+          <w:rFonts w:ascii="Google Sans" w:eastAsia="Google Sans" w:hAnsi="Google Sans" w:cs="Google Sans"/>
+          <w:color w:val="1F1F1F"/>
         </w:rPr>
         <w:t>Prototyped a portable diagnostic tool using Time-Domain Reflectometry principles to precisely pinpoint faults in buried infrastructure.</w:t>
       </w:r>
@@ -1199,20 +1070,36 @@
           <w:between w:val="nil"/>
         </w:pBdr>
         <w:spacing w:after="120" w:line="275" w:lineRule="auto"/>
-        <w:rPr>
-          <w:rFonts w:ascii="Times New Roman" w:hAnsi="Times New Roman" w:cs="Times New Roman"/>
-          <w:sz w:val="24"/>
-          <w:szCs w:val="24"/>
-        </w:rPr>
-      </w:pPr>
-      <w:r>
-        <w:rPr>
-          <w:rFonts w:ascii="Times New Roman" w:eastAsia="Google Sans" w:hAnsi="Times New Roman" w:cs="Times New Roman"/>
-          <w:color w:val="1F1F1F"/>
-          <w:sz w:val="24"/>
-          <w:szCs w:val="24"/>
-        </w:rPr>
-        <w:t>Programmed a microcontroller to calculate distance-to-fault metrics from voltage drops, reducing physical troubleshooting labour.</w:t>
+      </w:pPr>
+      <w:r>
+        <w:rPr>
+          <w:rFonts w:ascii="Google Sans" w:eastAsia="Google Sans" w:hAnsi="Google Sans" w:cs="Google Sans"/>
+          <w:color w:val="1F1F1F"/>
+        </w:rPr>
+        <w:t>Programmed a microcontroller to calculate distance-to-fault metrics from voltage drops, reducing physical troubleshootin</w:t>
+      </w:r>
+      <w:r>
+        <w:rPr>
+          <w:rFonts w:ascii="Google Sans" w:eastAsia="Google Sans" w:hAnsi="Google Sans" w:cs="Google Sans"/>
+          <w:color w:val="1F1F1F"/>
+        </w:rPr>
+        <w:t xml:space="preserve">g </w:t>
+      </w:r>
+      <w:proofErr w:type="spellStart"/>
+      <w:r>
+        <w:rPr>
+          <w:rFonts w:ascii="Google Sans" w:eastAsia="Google Sans" w:hAnsi="Google Sans" w:cs="Google Sans"/>
+          <w:color w:val="1F1F1F"/>
+        </w:rPr>
+        <w:t>labor</w:t>
+      </w:r>
+      <w:proofErr w:type="spellEnd"/>
+      <w:r>
+        <w:rPr>
+          <w:rFonts w:ascii="Google Sans" w:eastAsia="Google Sans" w:hAnsi="Google Sans" w:cs="Google Sans"/>
+          <w:color w:val="1F1F1F"/>
+        </w:rPr>
+        <w:t>.</w:t>
       </w:r>
     </w:p>
     <w:p>
@@ -1226,29 +1113,23 @@
         </w:pBdr>
         <w:spacing w:line="275" w:lineRule="auto"/>
         <w:rPr>
-          <w:rFonts w:ascii="Times New Roman" w:eastAsia="Google Sans" w:hAnsi="Times New Roman" w:cs="Times New Roman"/>
-          <w:color w:val="1F1F1F"/>
-          <w:sz w:val="24"/>
-          <w:szCs w:val="24"/>
-        </w:rPr>
-      </w:pPr>
-      <w:r>
-        <w:rPr>
-          <w:rFonts w:ascii="Times New Roman" w:eastAsia="Google Sans" w:hAnsi="Times New Roman" w:cs="Times New Roman"/>
+          <w:rFonts w:ascii="Google Sans" w:eastAsia="Google Sans" w:hAnsi="Google Sans" w:cs="Google Sans"/>
+          <w:color w:val="1F1F1F"/>
+        </w:rPr>
+      </w:pPr>
+      <w:r>
+        <w:rPr>
+          <w:rFonts w:ascii="Google Sans" w:eastAsia="Google Sans" w:hAnsi="Google Sans" w:cs="Google Sans"/>
           <w:b/>
           <w:bCs/>
           <w:color w:val="1F1F1F"/>
-          <w:sz w:val="24"/>
-          <w:szCs w:val="24"/>
         </w:rPr>
         <w:t>IoT-Based Secure Access &amp; Data Logging System</w:t>
       </w:r>
       <w:r>
         <w:rPr>
-          <w:rFonts w:ascii="Times New Roman" w:eastAsia="Google Sans" w:hAnsi="Times New Roman" w:cs="Times New Roman"/>
-          <w:color w:val="1F1F1F"/>
-          <w:sz w:val="24"/>
-          <w:szCs w:val="24"/>
+          <w:rFonts w:ascii="Google Sans" w:eastAsia="Google Sans" w:hAnsi="Google Sans" w:cs="Google Sans"/>
+          <w:color w:val="1F1F1F"/>
         </w:rPr>
         <w:t xml:space="preserve"> | Aug 2024 – Sep 2024</w:t>
       </w:r>
@@ -1267,18 +1148,11 @@
           <w:between w:val="nil"/>
         </w:pBdr>
         <w:spacing w:line="275" w:lineRule="auto"/>
-        <w:rPr>
-          <w:rFonts w:ascii="Times New Roman" w:hAnsi="Times New Roman" w:cs="Times New Roman"/>
-          <w:sz w:val="24"/>
-          <w:szCs w:val="24"/>
-        </w:rPr>
-      </w:pPr>
-      <w:r>
-        <w:rPr>
-          <w:rFonts w:ascii="Times New Roman" w:eastAsia="Google Sans" w:hAnsi="Times New Roman" w:cs="Times New Roman"/>
-          <w:color w:val="1F1F1F"/>
-          <w:sz w:val="24"/>
-          <w:szCs w:val="24"/>
+      </w:pPr>
+      <w:r>
+        <w:rPr>
+          <w:rFonts w:ascii="Google Sans" w:eastAsia="Google Sans" w:hAnsi="Google Sans" w:cs="Google Sans"/>
+          <w:color w:val="1F1F1F"/>
         </w:rPr>
         <w:t>Engineered a hardware access control prototype integrating serial sensor inputs with real-time cloud-based monitoring.</w:t>
       </w:r>
@@ -1297,18 +1171,11 @@
           <w:between w:val="nil"/>
         </w:pBdr>
         <w:spacing w:after="120" w:line="275" w:lineRule="auto"/>
-        <w:rPr>
-          <w:rFonts w:ascii="Times New Roman" w:hAnsi="Times New Roman" w:cs="Times New Roman"/>
-          <w:sz w:val="24"/>
-          <w:szCs w:val="24"/>
-        </w:rPr>
-      </w:pPr>
-      <w:r>
-        <w:rPr>
-          <w:rFonts w:ascii="Times New Roman" w:eastAsia="Google Sans" w:hAnsi="Times New Roman" w:cs="Times New Roman"/>
-          <w:color w:val="1F1F1F"/>
-          <w:sz w:val="24"/>
-          <w:szCs w:val="24"/>
+      </w:pPr>
+      <w:r>
+        <w:rPr>
+          <w:rFonts w:ascii="Google Sans" w:eastAsia="Google Sans" w:hAnsi="Google Sans" w:cs="Google Sans"/>
+          <w:color w:val="1F1F1F"/>
         </w:rPr>
         <w:t>Interfaced RFID authentication with a Wi-Fi microcontroller for encrypted database logging and traceable personnel telemetry.</w:t>
       </w:r>
@@ -1318,13 +1185,13 @@
         <w:pStyle w:val="Heading2"/>
         <w:spacing w:before="120" w:after="120" w:line="275" w:lineRule="auto"/>
         <w:rPr>
-          <w:rFonts w:ascii="Times New Roman" w:eastAsia="Google Sans" w:hAnsi="Times New Roman" w:cs="Times New Roman"/>
-          <w:color w:val="1F1F1F"/>
-        </w:rPr>
-      </w:pPr>
-      <w:r>
-        <w:rPr>
-          <w:rFonts w:ascii="Times New Roman" w:eastAsia="Google Sans" w:hAnsi="Times New Roman" w:cs="Times New Roman"/>
+          <w:rFonts w:ascii="Google Sans" w:eastAsia="Google Sans" w:hAnsi="Google Sans" w:cs="Google Sans"/>
+          <w:color w:val="1F1F1F"/>
+        </w:rPr>
+      </w:pPr>
+      <w:r>
+        <w:rPr>
+          <w:rFonts w:ascii="Google Sans" w:eastAsia="Google Sans" w:hAnsi="Google Sans" w:cs="Google Sans"/>
           <w:color w:val="1F1F1F"/>
         </w:rPr>
         <w:t>Education</w:t>
@@ -1341,31 +1208,33 @@
         </w:pBdr>
         <w:spacing w:after="240" w:line="275" w:lineRule="auto"/>
         <w:rPr>
-          <w:rFonts w:ascii="Times New Roman" w:eastAsia="Google Sans" w:hAnsi="Times New Roman" w:cs="Times New Roman"/>
-          <w:color w:val="1F1F1F"/>
-          <w:sz w:val="24"/>
-          <w:szCs w:val="24"/>
-        </w:rPr>
-      </w:pPr>
-      <w:r>
-        <w:rPr>
-          <w:rFonts w:ascii="Times New Roman" w:eastAsia="Google Sans" w:hAnsi="Times New Roman" w:cs="Times New Roman"/>
+          <w:rFonts w:ascii="Google Sans" w:eastAsia="Google Sans" w:hAnsi="Google Sans" w:cs="Google Sans"/>
+          <w:color w:val="1F1F1F"/>
+        </w:rPr>
+      </w:pPr>
+      <w:r>
+        <w:rPr>
+          <w:rFonts w:ascii="Google Sans" w:eastAsia="Google Sans" w:hAnsi="Google Sans" w:cs="Google Sans"/>
           <w:b/>
           <w:bCs/>
           <w:color w:val="1F1F1F"/>
-          <w:sz w:val="24"/>
-          <w:szCs w:val="24"/>
         </w:rPr>
         <w:t>Machakos University</w:t>
       </w:r>
       <w:r>
         <w:rPr>
-          <w:rFonts w:ascii="Times New Roman" w:eastAsia="Google Sans" w:hAnsi="Times New Roman" w:cs="Times New Roman"/>
-          <w:color w:val="1F1F1F"/>
-          <w:sz w:val="24"/>
-          <w:szCs w:val="24"/>
-        </w:rPr>
-        <w:t xml:space="preserve"> | Bachelor of Science - Electrical and Electronics Engineering </w:t>
+          <w:rFonts w:ascii="Google Sans" w:eastAsia="Google Sans" w:hAnsi="Google Sans" w:cs="Google Sans"/>
+          <w:color w:val="1F1F1F"/>
+        </w:rPr>
+        <w:t xml:space="preserve"> | Bachelor of Science - Electrical and Electronics Engineering | Sep 2020 </w:t>
+      </w:r>
+      <w:r>
+        <w:rPr>
+          <w:rFonts w:ascii="Google Sans" w:eastAsia="Google Sans" w:hAnsi="Google Sans" w:cs="Google Sans"/>
+          <w:color w:val="1F1F1F"/>
+        </w:rPr>
+        <w:lastRenderedPageBreak/>
+        <w:t>- Present</w:t>
       </w:r>
     </w:p>
     <w:sectPr>

</xml_diff>